<commit_message>
Site export 2026-10-21 18:20
</commit_message>
<xml_diff>
--- a/cases/amaro-building-corp-20261016-180516/files/report.docx
+++ b/cases/amaro-building-corp-20261016-180516/files/report.docx
@@ -1773,6 +1773,11 @@
         </w:tc>
       </w:tr>
     </w:tbl>
+    <w:p>
+      <w:r>
+        <w:t>The form's ECB "In compliance" is the compliance status with the NYC Department of Finance as shown in PASSPort, which staff must confirm; the OATH records are supporting evidence.</w:t>
+      </w:r>
+    </w:p>
     <w:p>
       <w:pPr>
         <w:pStyle w:val="Heading2"/>

</xml_diff>